<commit_message>
chore(release): desktop and extension 2.2.4
Keep a single Windows install across updates, replace the Mac app in place,
show About (version/release date), and use one progress dialog through download
to restart/install. Also ships media preview, sample-file coverage, and related
desktop/extension fixes.

Co-authored-by: Cursor <cursoragent@cursor.com>
</commit_message>
<xml_diff>
--- a/样例文件/中文/示例文档.docx
+++ b/样例文件/中文/示例文档.docx
@@ -1,12 +1,20 @@
 
 <file path=word/document.xml><?xml version="1.0" encoding="utf-8"?>
-<w:document xmlns:wpc="http://schemas.microsoft.com/office/word/2010/wordprocessingCanvas" xmlns:mo="http://schemas.microsoft.com/office/mac/office/2008/main" xmlns:mc="http://schemas.openxmlformats.org/markup-compatibility/2006" xmlns:mv="urn:schemas-microsoft-com:mac:vml" xmlns:o="urn:schemas-microsoft-com:office:office" xmlns:r="http://schemas.openxmlformats.org/officeDocument/2006/relationships" xmlns:m="http://schemas.openxmlformats.org/officeDocument/2006/math" xmlns:v="urn:schemas-microsoft-com:vml" xmlns:wp14="http://schemas.microsoft.com/office/word/2010/wordprocessingDrawing" xmlns:wp="http://schemas.openxmlformats.org/drawingml/2006/wordprocessingDrawing" xmlns:w10="urn:schemas-microsoft-com:office:word" xmlns:w="http://schemas.openxmlformats.org/wordprocessingml/2006/main" xmlns:w14="http://schemas.microsoft.com/office/word/2010/wordml" xmlns:wpg="http://schemas.microsoft.com/office/word/2010/wordprocessingGroup" xmlns:wpi="http://schemas.microsoft.com/office/word/2010/wordprocessingInk" xmlns:wne="http://schemas.microsoft.com/office/word/2006/wordml" xmlns:wps="http://schemas.microsoft.com/office/word/2010/wordprocessingShape" mc:Ignorable="w14 wp14">
+<w:document xmlns:wpc="http://schemas.microsoft.com/office/word/2010/wordprocessingCanvas" xmlns:mc="http://schemas.openxmlformats.org/markup-compatibility/2006" xmlns:o="urn:schemas-microsoft-com:office:office" xmlns:r="http://schemas.openxmlformats.org/officeDocument/2006/relationships" xmlns:m="http://schemas.openxmlformats.org/officeDocument/2006/math" xmlns:v="urn:schemas-microsoft-com:vml" xmlns:wp14="http://schemas.microsoft.com/office/word/2010/wordprocessingDrawing" xmlns:wp="http://schemas.openxmlformats.org/drawingml/2006/wordprocessingDrawing" xmlns:w10="urn:schemas-microsoft-com:office:word" xmlns:w="http://schemas.openxmlformats.org/wordprocessingml/2006/main" xmlns:w14="http://schemas.microsoft.com/office/word/2010/wordml" xmlns:w15="http://schemas.microsoft.com/office/word/2012/wordml" xmlns:w16se="http://schemas.microsoft.com/office/word/2015/wordml/symex" xmlns:w16cid="http://schemas.microsoft.com/office/word/2016/wordml/cid" xmlns:w16="http://schemas.microsoft.com/office/word/2018/wordml" xmlns:w16cex="http://schemas.microsoft.com/office/word/2018/wordml/cex" xmlns:w16sdtdh="http://schemas.microsoft.com/office/word/2020/wordml/sdtdatahash" xmlns:wne="http://schemas.microsoft.com/office/word/2006/wordml" xmlns:wpg="http://schemas.microsoft.com/office/word/2010/wordprocessingGroup" xmlns:wps="http://schemas.microsoft.com/office/word/2010/wordprocessingShape" mc:Ignorable="w14 w15 w16se w16cid w16 w16cex w16sdtdh wp14">
   <w:body>
     <w:p>
       <w:pPr>
         <w:pStyle w:val="Title"/>
       </w:pPr>
       <w:r>
+        <w:rPr>
+          <w:rFonts w:ascii="Calibri" w:hAnsi="Calibri" w:eastAsia="ＭＳ ゴシック" w:cs="Calibri" w:asciiTheme="majorHAnsi" w:hAnsiTheme="majorHAnsi" w:eastAsiaTheme="majorEastAsia" w:csTheme="majorBidi"/>
+          <w:color w:val="17365D" w:themeColor="text2" w:themeShade="BF"/>
+          <w:spacing w:val="5"/>
+          <w:kern w:val="28"/>
+          <w:sz w:val="52"/>
+          <w:szCs w:val="52"/>
+        </w:rPr>
         <w:t>示例项目文档</w:t>
       </w:r>
     </w:p>
@@ -15,37 +23,81 @@
         <w:pStyle w:val="Heading1"/>
       </w:pPr>
       <w:r>
+        <w:rPr>
+          <w:rFonts w:ascii="Calibri" w:hAnsi="Calibri" w:eastAsia="ＭＳ ゴシック" w:cs="Calibri" w:asciiTheme="majorHAnsi" w:hAnsiTheme="majorHAnsi" w:eastAsiaTheme="majorEastAsia" w:csTheme="majorBidi"/>
+          <w:b/>
+          <w:bCs/>
+          <w:color w:val="365F91" w:themeColor="accent1" w:themeShade="BF"/>
+          <w:sz w:val="28"/>
+          <w:szCs w:val="28"/>
+        </w:rPr>
         <w:t>1. 概述</w:t>
       </w:r>
     </w:p>
     <w:p>
+      <w:pPr>
+        <w:spacing w:after="200" w:line="276" w:lineRule="auto"/>
+      </w:pPr>
       <w:r>
+        <w:rPr>
+          <w:rFonts w:ascii="Cambria" w:hAnsi="Cambria" w:eastAsia="ＭＳ 明朝" w:cs="Cambria" w:asciiTheme="minorHAnsi" w:hAnsiTheme="minorHAnsi" w:eastAsiaTheme="minorEastAsia" w:csTheme="minorBidi"/>
+          <w:sz w:val="22"/>
+          <w:szCs w:val="22"/>
+        </w:rPr>
         <w:t>本文件为演示用途的虚构内容，不包含任何真实组织、人员或业务信息。</w:t>
       </w:r>
     </w:p>
     <w:p>
+      <w:pPr>
+        <w:spacing w:after="200" w:line="276" w:lineRule="auto"/>
+      </w:pPr>
       <w:r>
+        <w:rPr>
+          <w:rFonts w:ascii="Cambria" w:hAnsi="Cambria" w:eastAsia="ＭＳ 明朝" w:cs="Cambria" w:asciiTheme="minorHAnsi" w:hAnsiTheme="minorHAnsi" w:eastAsiaTheme="minorEastAsia" w:csTheme="minorBidi"/>
+          <w:sz w:val="22"/>
+          <w:szCs w:val="22"/>
+        </w:rPr>
         <w:t>这里用于展示标题、段落、列表与表格在预览器中的渲染效果。</w:t>
       </w:r>
     </w:p>
     <w:p>
+      <w:pPr>
+        <w:spacing w:after="200" w:line="276" w:lineRule="auto"/>
+      </w:pPr>
       <w:r>
+        <w:rPr>
+          <w:rFonts w:ascii="Cambria" w:hAnsi="Cambria" w:eastAsia="ＭＳ 明朝" w:cs="Cambria" w:asciiTheme="minorHAnsi" w:hAnsiTheme="minorHAnsi" w:eastAsiaTheme="minorEastAsia" w:csTheme="minorBidi"/>
+          <w:sz w:val="22"/>
+          <w:szCs w:val="22"/>
+        </w:rPr>
         <w:t>示例文本：Lorem ipsum dolor sit amet, consectetur adipiscing elit.</w:t>
       </w:r>
     </w:p>
     <w:p>
       <w:pPr>
         <w:pStyle w:val="ListBullet"/>
+        <w:ind w:left="360" w:hanging="360"/>
       </w:pPr>
       <w:r>
+        <w:rPr>
+          <w:rFonts w:ascii="Cambria" w:hAnsi="Cambria" w:eastAsia="ＭＳ 明朝" w:cs="Cambria" w:asciiTheme="minorHAnsi" w:hAnsiTheme="minorHAnsi" w:eastAsiaTheme="minorEastAsia" w:csTheme="minorBidi"/>
+          <w:sz w:val="22"/>
+          <w:szCs w:val="22"/>
+        </w:rPr>
         <w:t>示例要点一</w:t>
       </w:r>
     </w:p>
     <w:p>
       <w:pPr>
         <w:pStyle w:val="ListBullet"/>
+        <w:ind w:left="360" w:hanging="360"/>
       </w:pPr>
       <w:r>
+        <w:rPr>
+          <w:rFonts w:ascii="Cambria" w:hAnsi="Cambria" w:eastAsia="ＭＳ 明朝" w:cs="Cambria" w:asciiTheme="minorHAnsi" w:hAnsiTheme="minorHAnsi" w:eastAsiaTheme="minorEastAsia" w:csTheme="minorBidi"/>
+          <w:sz w:val="22"/>
+          <w:szCs w:val="22"/>
+        </w:rPr>
         <w:t>示例要点二</w:t>
       </w:r>
     </w:p>
@@ -54,37 +106,81 @@
         <w:pStyle w:val="Heading1"/>
       </w:pPr>
       <w:r>
+        <w:rPr>
+          <w:rFonts w:ascii="Calibri" w:hAnsi="Calibri" w:eastAsia="ＭＳ ゴシック" w:cs="Calibri" w:asciiTheme="majorHAnsi" w:hAnsiTheme="majorHAnsi" w:eastAsiaTheme="majorEastAsia" w:csTheme="majorBidi"/>
+          <w:b/>
+          <w:bCs/>
+          <w:color w:val="365F91" w:themeColor="accent1" w:themeShade="BF"/>
+          <w:sz w:val="28"/>
+          <w:szCs w:val="28"/>
+        </w:rPr>
         <w:t>2. 功能说明</w:t>
       </w:r>
     </w:p>
     <w:p>
+      <w:pPr>
+        <w:spacing w:after="200" w:line="276" w:lineRule="auto"/>
+      </w:pPr>
       <w:r>
+        <w:rPr>
+          <w:rFonts w:ascii="Cambria" w:hAnsi="Cambria" w:eastAsia="ＭＳ 明朝" w:cs="Cambria" w:asciiTheme="minorHAnsi" w:hAnsiTheme="minorHAnsi" w:eastAsiaTheme="minorEastAsia" w:csTheme="minorBidi"/>
+          <w:sz w:val="22"/>
+          <w:szCs w:val="22"/>
+        </w:rPr>
         <w:t>本文件为演示用途的虚构内容，不包含任何真实组织、人员或业务信息。</w:t>
       </w:r>
     </w:p>
     <w:p>
+      <w:pPr>
+        <w:spacing w:after="200" w:line="276" w:lineRule="auto"/>
+      </w:pPr>
       <w:r>
+        <w:rPr>
+          <w:rFonts w:ascii="Cambria" w:hAnsi="Cambria" w:eastAsia="ＭＳ 明朝" w:cs="Cambria" w:asciiTheme="minorHAnsi" w:hAnsiTheme="minorHAnsi" w:eastAsiaTheme="minorEastAsia" w:csTheme="minorBidi"/>
+          <w:sz w:val="22"/>
+          <w:szCs w:val="22"/>
+        </w:rPr>
         <w:t>这里用于展示标题、段落、列表与表格在预览器中的渲染效果。</w:t>
       </w:r>
     </w:p>
     <w:p>
+      <w:pPr>
+        <w:spacing w:after="200" w:line="276" w:lineRule="auto"/>
+      </w:pPr>
       <w:r>
+        <w:rPr>
+          <w:rFonts w:ascii="Cambria" w:hAnsi="Cambria" w:eastAsia="ＭＳ 明朝" w:cs="Cambria" w:asciiTheme="minorHAnsi" w:hAnsiTheme="minorHAnsi" w:eastAsiaTheme="minorEastAsia" w:csTheme="minorBidi"/>
+          <w:sz w:val="22"/>
+          <w:szCs w:val="22"/>
+        </w:rPr>
         <w:t>示例文本：Lorem ipsum dolor sit amet, consectetur adipiscing elit.</w:t>
       </w:r>
     </w:p>
     <w:p>
       <w:pPr>
         <w:pStyle w:val="ListBullet"/>
+        <w:ind w:left="360" w:hanging="360"/>
       </w:pPr>
       <w:r>
+        <w:rPr>
+          <w:rFonts w:ascii="Cambria" w:hAnsi="Cambria" w:eastAsia="ＭＳ 明朝" w:cs="Cambria" w:asciiTheme="minorHAnsi" w:hAnsiTheme="minorHAnsi" w:eastAsiaTheme="minorEastAsia" w:csTheme="minorBidi"/>
+          <w:sz w:val="22"/>
+          <w:szCs w:val="22"/>
+        </w:rPr>
         <w:t>示例要点一</w:t>
       </w:r>
     </w:p>
     <w:p>
       <w:pPr>
         <w:pStyle w:val="ListBullet"/>
+        <w:ind w:left="360" w:hanging="360"/>
       </w:pPr>
       <w:r>
+        <w:rPr>
+          <w:rFonts w:ascii="Cambria" w:hAnsi="Cambria" w:eastAsia="ＭＳ 明朝" w:cs="Cambria" w:asciiTheme="minorHAnsi" w:hAnsiTheme="minorHAnsi" w:eastAsiaTheme="minorEastAsia" w:csTheme="minorBidi"/>
+          <w:sz w:val="22"/>
+          <w:szCs w:val="22"/>
+        </w:rPr>
         <w:t>示例要点二</w:t>
       </w:r>
     </w:p>
@@ -93,45 +189,103 @@
         <w:pStyle w:val="Heading1"/>
       </w:pPr>
       <w:r>
+        <w:rPr>
+          <w:rFonts w:ascii="Calibri" w:hAnsi="Calibri" w:eastAsia="ＭＳ ゴシック" w:cs="Calibri" w:asciiTheme="majorHAnsi" w:hAnsiTheme="majorHAnsi" w:eastAsiaTheme="majorEastAsia" w:csTheme="majorBidi"/>
+          <w:b/>
+          <w:bCs/>
+          <w:color w:val="365F91" w:themeColor="accent1" w:themeShade="BF"/>
+          <w:sz w:val="28"/>
+          <w:szCs w:val="28"/>
+        </w:rPr>
         <w:t>3. 附录</w:t>
       </w:r>
     </w:p>
     <w:p>
+      <w:pPr>
+        <w:spacing w:after="200" w:line="276" w:lineRule="auto"/>
+      </w:pPr>
       <w:r>
+        <w:rPr>
+          <w:rFonts w:ascii="Cambria" w:hAnsi="Cambria" w:eastAsia="ＭＳ 明朝" w:cs="Cambria" w:asciiTheme="minorHAnsi" w:hAnsiTheme="minorHAnsi" w:eastAsiaTheme="minorEastAsia" w:csTheme="minorBidi"/>
+          <w:sz w:val="22"/>
+          <w:szCs w:val="22"/>
+        </w:rPr>
         <w:t>本文件为演示用途的虚构内容，不包含任何真实组织、人员或业务信息。</w:t>
       </w:r>
     </w:p>
     <w:p>
+      <w:pPr>
+        <w:spacing w:after="200" w:line="276" w:lineRule="auto"/>
+      </w:pPr>
       <w:r>
+        <w:rPr>
+          <w:rFonts w:ascii="Cambria" w:hAnsi="Cambria" w:eastAsia="ＭＳ 明朝" w:cs="Cambria" w:asciiTheme="minorHAnsi" w:hAnsiTheme="minorHAnsi" w:eastAsiaTheme="minorEastAsia" w:csTheme="minorBidi"/>
+          <w:sz w:val="22"/>
+          <w:szCs w:val="22"/>
+        </w:rPr>
         <w:t>这里用于展示标题、段落、列表与表格在预览器中的渲染效果。</w:t>
       </w:r>
     </w:p>
     <w:p>
+      <w:pPr>
+        <w:spacing w:after="200" w:line="276" w:lineRule="auto"/>
+      </w:pPr>
       <w:r>
+        <w:rPr>
+          <w:rFonts w:ascii="Cambria" w:hAnsi="Cambria" w:eastAsia="ＭＳ 明朝" w:cs="Cambria" w:asciiTheme="minorHAnsi" w:hAnsiTheme="minorHAnsi" w:eastAsiaTheme="minorEastAsia" w:csTheme="minorBidi"/>
+          <w:sz w:val="22"/>
+          <w:szCs w:val="22"/>
+        </w:rPr>
         <w:t>示例文本：Lorem ipsum dolor sit amet, consectetur adipiscing elit.</w:t>
       </w:r>
     </w:p>
     <w:p>
       <w:pPr>
         <w:pStyle w:val="ListBullet"/>
+        <w:ind w:left="360" w:hanging="360"/>
       </w:pPr>
       <w:r>
+        <w:rPr>
+          <w:rFonts w:ascii="Cambria" w:hAnsi="Cambria" w:eastAsia="ＭＳ 明朝" w:cs="Cambria" w:asciiTheme="minorHAnsi" w:hAnsiTheme="minorHAnsi" w:eastAsiaTheme="minorEastAsia" w:csTheme="minorBidi"/>
+          <w:sz w:val="22"/>
+          <w:szCs w:val="22"/>
+        </w:rPr>
         <w:t>示例要点一</w:t>
       </w:r>
     </w:p>
     <w:p>
       <w:pPr>
         <w:pStyle w:val="ListBullet"/>
+        <w:ind w:left="360" w:hanging="360"/>
       </w:pPr>
       <w:r>
+        <w:rPr>
+          <w:rFonts w:ascii="Cambria" w:hAnsi="Cambria" w:eastAsia="ＭＳ 明朝" w:cs="Cambria" w:asciiTheme="minorHAnsi" w:hAnsiTheme="minorHAnsi" w:eastAsiaTheme="minorEastAsia" w:csTheme="minorBidi"/>
+          <w:sz w:val="22"/>
+          <w:szCs w:val="22"/>
+        </w:rPr>
         <w:t>示例要点二</w:t>
       </w:r>
     </w:p>
     <w:tbl>
       <w:tblPr>
         <w:tblStyle w:val="TableGrid"/>
-        <w:tblW w:type="auto" w:w="0"/>
-        <w:tblLook w:firstColumn="1" w:firstRow="1" w:lastColumn="0" w:lastRow="0" w:noHBand="0" w:noVBand="1" w:val="04A0"/>
+        <w:tblW w:w="0" w:type="auto"/>
+        <w:tblBorders>
+          <w:top w:val="single" w:sz="4" w:space="0" w:color="auto"/>
+          <w:left w:val="single" w:sz="4" w:space="0" w:color="auto"/>
+          <w:bottom w:val="single" w:sz="4" w:space="0" w:color="auto"/>
+          <w:right w:val="single" w:sz="4" w:space="0" w:color="auto"/>
+          <w:insideH w:val="single" w:sz="4" w:space="0" w:color="auto"/>
+          <w:insideV w:val="single" w:sz="4" w:space="0" w:color="auto"/>
+        </w:tblBorders>
+        <w:tblCellMar>
+          <w:top w:w="0" w:type="dxa"/>
+          <w:left w:w="108" w:type="dxa"/>
+          <w:bottom w:w="0" w:type="dxa"/>
+          <w:right w:w="108" w:type="dxa"/>
+        </w:tblCellMar>
+        <w:tblLook w:firstRow="1" w:firstColumn="1" w:noVBand="1"/>
       </w:tblPr>
       <w:tblGrid>
         <w:gridCol w:w="1728"/>
@@ -143,50 +297,150 @@
       <w:tr>
         <w:tc>
           <w:tcPr>
-            <w:tcW w:type="dxa" w:w="1728"/>
+            <w:tcW w:w="1728" w:type="dxa"/>
+            <w:tcBorders>
+              <w:top w:val="single" w:sz="4" w:space="0" w:color="auto"/>
+              <w:left w:val="single" w:sz="4" w:space="0" w:color="auto"/>
+              <w:bottom w:val="single" w:sz="4" w:space="0" w:color="auto"/>
+              <w:right w:val="single" w:sz="4" w:space="0" w:color="auto"/>
+            </w:tcBorders>
+            <w:tcMar>
+              <w:top w:w="0" w:type="dxa"/>
+              <w:left w:w="108" w:type="dxa"/>
+              <w:bottom w:w="0" w:type="dxa"/>
+              <w:right w:w="108" w:type="dxa"/>
+            </w:tcMar>
           </w:tcPr>
           <w:p>
+            <w:pPr>
+              <w:spacing w:after="200" w:line="276" w:lineRule="auto"/>
+            </w:pPr>
             <w:r>
+              <w:rPr>
+                <w:rFonts w:ascii="Cambria" w:hAnsi="Cambria" w:eastAsia="ＭＳ 明朝" w:cs="Cambria" w:asciiTheme="minorHAnsi" w:hAnsiTheme="minorHAnsi" w:eastAsiaTheme="minorEastAsia" w:csTheme="minorBidi"/>
+                <w:sz w:val="22"/>
+                <w:szCs w:val="22"/>
+              </w:rPr>
               <w:t>编号</w:t>
             </w:r>
           </w:p>
         </w:tc>
         <w:tc>
           <w:tcPr>
-            <w:tcW w:type="dxa" w:w="1728"/>
+            <w:tcW w:w="1728" w:type="dxa"/>
+            <w:tcBorders>
+              <w:top w:val="single" w:sz="4" w:space="0" w:color="auto"/>
+              <w:left w:val="single" w:sz="4" w:space="0" w:color="auto"/>
+              <w:bottom w:val="single" w:sz="4" w:space="0" w:color="auto"/>
+              <w:right w:val="single" w:sz="4" w:space="0" w:color="auto"/>
+            </w:tcBorders>
+            <w:tcMar>
+              <w:top w:w="0" w:type="dxa"/>
+              <w:left w:w="108" w:type="dxa"/>
+              <w:bottom w:w="0" w:type="dxa"/>
+              <w:right w:w="108" w:type="dxa"/>
+            </w:tcMar>
           </w:tcPr>
           <w:p>
+            <w:pPr>
+              <w:spacing w:after="200" w:line="276" w:lineRule="auto"/>
+            </w:pPr>
             <w:r>
+              <w:rPr>
+                <w:rFonts w:ascii="Cambria" w:hAnsi="Cambria" w:eastAsia="ＭＳ 明朝" w:cs="Cambria" w:asciiTheme="minorHAnsi" w:hAnsiTheme="minorHAnsi" w:eastAsiaTheme="minorEastAsia" w:csTheme="minorBidi"/>
+                <w:sz w:val="22"/>
+                <w:szCs w:val="22"/>
+              </w:rPr>
               <w:t>名称</w:t>
             </w:r>
           </w:p>
         </w:tc>
         <w:tc>
           <w:tcPr>
-            <w:tcW w:type="dxa" w:w="1728"/>
+            <w:tcW w:w="1728" w:type="dxa"/>
+            <w:tcBorders>
+              <w:top w:val="single" w:sz="4" w:space="0" w:color="auto"/>
+              <w:left w:val="single" w:sz="4" w:space="0" w:color="auto"/>
+              <w:bottom w:val="single" w:sz="4" w:space="0" w:color="auto"/>
+              <w:right w:val="single" w:sz="4" w:space="0" w:color="auto"/>
+            </w:tcBorders>
+            <w:tcMar>
+              <w:top w:w="0" w:type="dxa"/>
+              <w:left w:w="108" w:type="dxa"/>
+              <w:bottom w:w="0" w:type="dxa"/>
+              <w:right w:w="108" w:type="dxa"/>
+            </w:tcMar>
           </w:tcPr>
           <w:p>
+            <w:pPr>
+              <w:spacing w:after="200" w:line="276" w:lineRule="auto"/>
+            </w:pPr>
             <w:r>
+              <w:rPr>
+                <w:rFonts w:ascii="Cambria" w:hAnsi="Cambria" w:eastAsia="ＭＳ 明朝" w:cs="Cambria" w:asciiTheme="minorHAnsi" w:hAnsiTheme="minorHAnsi" w:eastAsiaTheme="minorEastAsia" w:csTheme="minorBidi"/>
+                <w:sz w:val="22"/>
+                <w:szCs w:val="22"/>
+              </w:rPr>
               <w:t>分类</w:t>
             </w:r>
           </w:p>
         </w:tc>
         <w:tc>
           <w:tcPr>
-            <w:tcW w:type="dxa" w:w="1728"/>
+            <w:tcW w:w="1728" w:type="dxa"/>
+            <w:tcBorders>
+              <w:top w:val="single" w:sz="4" w:space="0" w:color="auto"/>
+              <w:left w:val="single" w:sz="4" w:space="0" w:color="auto"/>
+              <w:bottom w:val="single" w:sz="4" w:space="0" w:color="auto"/>
+              <w:right w:val="single" w:sz="4" w:space="0" w:color="auto"/>
+            </w:tcBorders>
+            <w:tcMar>
+              <w:top w:w="0" w:type="dxa"/>
+              <w:left w:w="108" w:type="dxa"/>
+              <w:bottom w:w="0" w:type="dxa"/>
+              <w:right w:w="108" w:type="dxa"/>
+            </w:tcMar>
           </w:tcPr>
           <w:p>
+            <w:pPr>
+              <w:spacing w:after="200" w:line="276" w:lineRule="auto"/>
+            </w:pPr>
             <w:r>
+              <w:rPr>
+                <w:rFonts w:ascii="Cambria" w:hAnsi="Cambria" w:eastAsia="ＭＳ 明朝" w:cs="Cambria" w:asciiTheme="minorHAnsi" w:hAnsiTheme="minorHAnsi" w:eastAsiaTheme="minorEastAsia" w:csTheme="minorBidi"/>
+                <w:sz w:val="22"/>
+                <w:szCs w:val="22"/>
+              </w:rPr>
               <w:t>状态</w:t>
             </w:r>
           </w:p>
         </w:tc>
         <w:tc>
           <w:tcPr>
-            <w:tcW w:type="dxa" w:w="1728"/>
+            <w:tcW w:w="1728" w:type="dxa"/>
+            <w:tcBorders>
+              <w:top w:val="single" w:sz="4" w:space="0" w:color="auto"/>
+              <w:left w:val="single" w:sz="4" w:space="0" w:color="auto"/>
+              <w:bottom w:val="single" w:sz="4" w:space="0" w:color="auto"/>
+              <w:right w:val="single" w:sz="4" w:space="0" w:color="auto"/>
+            </w:tcBorders>
+            <w:tcMar>
+              <w:top w:w="0" w:type="dxa"/>
+              <w:left w:w="108" w:type="dxa"/>
+              <w:bottom w:w="0" w:type="dxa"/>
+              <w:right w:w="108" w:type="dxa"/>
+            </w:tcMar>
           </w:tcPr>
           <w:p>
+            <w:pPr>
+              <w:spacing w:after="200" w:line="276" w:lineRule="auto"/>
+            </w:pPr>
             <w:r>
+              <w:rPr>
+                <w:rFonts w:ascii="Cambria" w:hAnsi="Cambria" w:eastAsia="ＭＳ 明朝" w:cs="Cambria" w:asciiTheme="minorHAnsi" w:hAnsiTheme="minorHAnsi" w:eastAsiaTheme="minorEastAsia" w:csTheme="minorBidi"/>
+                <w:sz w:val="22"/>
+                <w:szCs w:val="22"/>
+              </w:rPr>
               <w:t>负责人</w:t>
             </w:r>
           </w:p>
@@ -195,50 +449,150 @@
       <w:tr>
         <w:tc>
           <w:tcPr>
-            <w:tcW w:type="dxa" w:w="1728"/>
+            <w:tcW w:w="1728" w:type="dxa"/>
+            <w:tcBorders>
+              <w:top w:val="single" w:sz="4" w:space="0" w:color="auto"/>
+              <w:left w:val="single" w:sz="4" w:space="0" w:color="auto"/>
+              <w:bottom w:val="single" w:sz="4" w:space="0" w:color="auto"/>
+              <w:right w:val="single" w:sz="4" w:space="0" w:color="auto"/>
+            </w:tcBorders>
+            <w:tcMar>
+              <w:top w:w="0" w:type="dxa"/>
+              <w:left w:w="108" w:type="dxa"/>
+              <w:bottom w:w="0" w:type="dxa"/>
+              <w:right w:w="108" w:type="dxa"/>
+            </w:tcMar>
           </w:tcPr>
           <w:p>
+            <w:pPr>
+              <w:spacing w:after="200" w:line="276" w:lineRule="auto"/>
+            </w:pPr>
             <w:r>
+              <w:rPr>
+                <w:rFonts w:ascii="Cambria" w:hAnsi="Cambria" w:eastAsia="ＭＳ 明朝" w:cs="Cambria" w:asciiTheme="minorHAnsi" w:hAnsiTheme="minorHAnsi" w:eastAsiaTheme="minorEastAsia" w:csTheme="minorBidi"/>
+                <w:sz w:val="22"/>
+                <w:szCs w:val="22"/>
+              </w:rPr>
               <w:t>A-001</w:t>
             </w:r>
           </w:p>
         </w:tc>
         <w:tc>
           <w:tcPr>
-            <w:tcW w:type="dxa" w:w="1728"/>
+            <w:tcW w:w="1728" w:type="dxa"/>
+            <w:tcBorders>
+              <w:top w:val="single" w:sz="4" w:space="0" w:color="auto"/>
+              <w:left w:val="single" w:sz="4" w:space="0" w:color="auto"/>
+              <w:bottom w:val="single" w:sz="4" w:space="0" w:color="auto"/>
+              <w:right w:val="single" w:sz="4" w:space="0" w:color="auto"/>
+            </w:tcBorders>
+            <w:tcMar>
+              <w:top w:w="0" w:type="dxa"/>
+              <w:left w:w="108" w:type="dxa"/>
+              <w:bottom w:w="0" w:type="dxa"/>
+              <w:right w:w="108" w:type="dxa"/>
+            </w:tcMar>
           </w:tcPr>
           <w:p>
+            <w:pPr>
+              <w:spacing w:after="200" w:line="276" w:lineRule="auto"/>
+            </w:pPr>
             <w:r>
+              <w:rPr>
+                <w:rFonts w:ascii="Cambria" w:hAnsi="Cambria" w:eastAsia="ＭＳ 明朝" w:cs="Cambria" w:asciiTheme="minorHAnsi" w:hAnsiTheme="minorHAnsi" w:eastAsiaTheme="minorEastAsia" w:csTheme="minorBidi"/>
+                <w:sz w:val="22"/>
+                <w:szCs w:val="22"/>
+              </w:rPr>
               <w:t>示例功能一</w:t>
             </w:r>
           </w:p>
         </w:tc>
         <w:tc>
           <w:tcPr>
-            <w:tcW w:type="dxa" w:w="1728"/>
+            <w:tcW w:w="1728" w:type="dxa"/>
+            <w:tcBorders>
+              <w:top w:val="single" w:sz="4" w:space="0" w:color="auto"/>
+              <w:left w:val="single" w:sz="4" w:space="0" w:color="auto"/>
+              <w:bottom w:val="single" w:sz="4" w:space="0" w:color="auto"/>
+              <w:right w:val="single" w:sz="4" w:space="0" w:color="auto"/>
+            </w:tcBorders>
+            <w:tcMar>
+              <w:top w:w="0" w:type="dxa"/>
+              <w:left w:w="108" w:type="dxa"/>
+              <w:bottom w:w="0" w:type="dxa"/>
+              <w:right w:w="108" w:type="dxa"/>
+            </w:tcMar>
           </w:tcPr>
           <w:p>
+            <w:pPr>
+              <w:spacing w:after="200" w:line="276" w:lineRule="auto"/>
+            </w:pPr>
             <w:r>
+              <w:rPr>
+                <w:rFonts w:ascii="Cambria" w:hAnsi="Cambria" w:eastAsia="ＭＳ 明朝" w:cs="Cambria" w:asciiTheme="minorHAnsi" w:hAnsiTheme="minorHAnsi" w:eastAsiaTheme="minorEastAsia" w:csTheme="minorBidi"/>
+                <w:sz w:val="22"/>
+                <w:szCs w:val="22"/>
+              </w:rPr>
               <w:t>类别甲</w:t>
             </w:r>
           </w:p>
         </w:tc>
         <w:tc>
           <w:tcPr>
-            <w:tcW w:type="dxa" w:w="1728"/>
+            <w:tcW w:w="1728" w:type="dxa"/>
+            <w:tcBorders>
+              <w:top w:val="single" w:sz="4" w:space="0" w:color="auto"/>
+              <w:left w:val="single" w:sz="4" w:space="0" w:color="auto"/>
+              <w:bottom w:val="single" w:sz="4" w:space="0" w:color="auto"/>
+              <w:right w:val="single" w:sz="4" w:space="0" w:color="auto"/>
+            </w:tcBorders>
+            <w:tcMar>
+              <w:top w:w="0" w:type="dxa"/>
+              <w:left w:w="108" w:type="dxa"/>
+              <w:bottom w:w="0" w:type="dxa"/>
+              <w:right w:w="108" w:type="dxa"/>
+            </w:tcMar>
           </w:tcPr>
           <w:p>
+            <w:pPr>
+              <w:spacing w:after="200" w:line="276" w:lineRule="auto"/>
+            </w:pPr>
             <w:r>
+              <w:rPr>
+                <w:rFonts w:ascii="Cambria" w:hAnsi="Cambria" w:eastAsia="ＭＳ 明朝" w:cs="Cambria" w:asciiTheme="minorHAnsi" w:hAnsiTheme="minorHAnsi" w:eastAsiaTheme="minorEastAsia" w:csTheme="minorBidi"/>
+                <w:sz w:val="22"/>
+                <w:szCs w:val="22"/>
+              </w:rPr>
               <w:t>已完成</w:t>
             </w:r>
           </w:p>
         </w:tc>
         <w:tc>
           <w:tcPr>
-            <w:tcW w:type="dxa" w:w="1728"/>
+            <w:tcW w:w="1728" w:type="dxa"/>
+            <w:tcBorders>
+              <w:top w:val="single" w:sz="4" w:space="0" w:color="auto"/>
+              <w:left w:val="single" w:sz="4" w:space="0" w:color="auto"/>
+              <w:bottom w:val="single" w:sz="4" w:space="0" w:color="auto"/>
+              <w:right w:val="single" w:sz="4" w:space="0" w:color="auto"/>
+            </w:tcBorders>
+            <w:tcMar>
+              <w:top w:w="0" w:type="dxa"/>
+              <w:left w:w="108" w:type="dxa"/>
+              <w:bottom w:w="0" w:type="dxa"/>
+              <w:right w:w="108" w:type="dxa"/>
+            </w:tcMar>
           </w:tcPr>
           <w:p>
+            <w:pPr>
+              <w:spacing w:after="200" w:line="276" w:lineRule="auto"/>
+            </w:pPr>
             <w:r>
+              <w:rPr>
+                <w:rFonts w:ascii="Cambria" w:hAnsi="Cambria" w:eastAsia="ＭＳ 明朝" w:cs="Cambria" w:asciiTheme="minorHAnsi" w:hAnsiTheme="minorHAnsi" w:eastAsiaTheme="minorEastAsia" w:csTheme="minorBidi"/>
+                <w:sz w:val="22"/>
+                <w:szCs w:val="22"/>
+              </w:rPr>
               <w:t>用户A</w:t>
             </w:r>
           </w:p>
@@ -247,50 +601,150 @@
       <w:tr>
         <w:tc>
           <w:tcPr>
-            <w:tcW w:type="dxa" w:w="1728"/>
+            <w:tcW w:w="1728" w:type="dxa"/>
+            <w:tcBorders>
+              <w:top w:val="single" w:sz="4" w:space="0" w:color="auto"/>
+              <w:left w:val="single" w:sz="4" w:space="0" w:color="auto"/>
+              <w:bottom w:val="single" w:sz="4" w:space="0" w:color="auto"/>
+              <w:right w:val="single" w:sz="4" w:space="0" w:color="auto"/>
+            </w:tcBorders>
+            <w:tcMar>
+              <w:top w:w="0" w:type="dxa"/>
+              <w:left w:w="108" w:type="dxa"/>
+              <w:bottom w:w="0" w:type="dxa"/>
+              <w:right w:w="108" w:type="dxa"/>
+            </w:tcMar>
           </w:tcPr>
           <w:p>
+            <w:pPr>
+              <w:spacing w:after="200" w:line="276" w:lineRule="auto"/>
+            </w:pPr>
             <w:r>
+              <w:rPr>
+                <w:rFonts w:ascii="Cambria" w:hAnsi="Cambria" w:eastAsia="ＭＳ 明朝" w:cs="Cambria" w:asciiTheme="minorHAnsi" w:hAnsiTheme="minorHAnsi" w:eastAsiaTheme="minorEastAsia" w:csTheme="minorBidi"/>
+                <w:sz w:val="22"/>
+                <w:szCs w:val="22"/>
+              </w:rPr>
               <w:t>A-002</w:t>
             </w:r>
           </w:p>
         </w:tc>
         <w:tc>
           <w:tcPr>
-            <w:tcW w:type="dxa" w:w="1728"/>
+            <w:tcW w:w="1728" w:type="dxa"/>
+            <w:tcBorders>
+              <w:top w:val="single" w:sz="4" w:space="0" w:color="auto"/>
+              <w:left w:val="single" w:sz="4" w:space="0" w:color="auto"/>
+              <w:bottom w:val="single" w:sz="4" w:space="0" w:color="auto"/>
+              <w:right w:val="single" w:sz="4" w:space="0" w:color="auto"/>
+            </w:tcBorders>
+            <w:tcMar>
+              <w:top w:w="0" w:type="dxa"/>
+              <w:left w:w="108" w:type="dxa"/>
+              <w:bottom w:w="0" w:type="dxa"/>
+              <w:right w:w="108" w:type="dxa"/>
+            </w:tcMar>
           </w:tcPr>
           <w:p>
+            <w:pPr>
+              <w:spacing w:after="200" w:line="276" w:lineRule="auto"/>
+            </w:pPr>
             <w:r>
+              <w:rPr>
+                <w:rFonts w:ascii="Cambria" w:hAnsi="Cambria" w:eastAsia="ＭＳ 明朝" w:cs="Cambria" w:asciiTheme="minorHAnsi" w:hAnsiTheme="minorHAnsi" w:eastAsiaTheme="minorEastAsia" w:csTheme="minorBidi"/>
+                <w:sz w:val="22"/>
+                <w:szCs w:val="22"/>
+              </w:rPr>
               <w:t>示例功能二</w:t>
             </w:r>
           </w:p>
         </w:tc>
         <w:tc>
           <w:tcPr>
-            <w:tcW w:type="dxa" w:w="1728"/>
+            <w:tcW w:w="1728" w:type="dxa"/>
+            <w:tcBorders>
+              <w:top w:val="single" w:sz="4" w:space="0" w:color="auto"/>
+              <w:left w:val="single" w:sz="4" w:space="0" w:color="auto"/>
+              <w:bottom w:val="single" w:sz="4" w:space="0" w:color="auto"/>
+              <w:right w:val="single" w:sz="4" w:space="0" w:color="auto"/>
+            </w:tcBorders>
+            <w:tcMar>
+              <w:top w:w="0" w:type="dxa"/>
+              <w:left w:w="108" w:type="dxa"/>
+              <w:bottom w:w="0" w:type="dxa"/>
+              <w:right w:w="108" w:type="dxa"/>
+            </w:tcMar>
           </w:tcPr>
           <w:p>
+            <w:pPr>
+              <w:spacing w:after="200" w:line="276" w:lineRule="auto"/>
+            </w:pPr>
             <w:r>
+              <w:rPr>
+                <w:rFonts w:ascii="Cambria" w:hAnsi="Cambria" w:eastAsia="ＭＳ 明朝" w:cs="Cambria" w:asciiTheme="minorHAnsi" w:hAnsiTheme="minorHAnsi" w:eastAsiaTheme="minorEastAsia" w:csTheme="minorBidi"/>
+                <w:sz w:val="22"/>
+                <w:szCs w:val="22"/>
+              </w:rPr>
               <w:t>类别乙</w:t>
             </w:r>
           </w:p>
         </w:tc>
         <w:tc>
           <w:tcPr>
-            <w:tcW w:type="dxa" w:w="1728"/>
+            <w:tcW w:w="1728" w:type="dxa"/>
+            <w:tcBorders>
+              <w:top w:val="single" w:sz="4" w:space="0" w:color="auto"/>
+              <w:left w:val="single" w:sz="4" w:space="0" w:color="auto"/>
+              <w:bottom w:val="single" w:sz="4" w:space="0" w:color="auto"/>
+              <w:right w:val="single" w:sz="4" w:space="0" w:color="auto"/>
+            </w:tcBorders>
+            <w:tcMar>
+              <w:top w:w="0" w:type="dxa"/>
+              <w:left w:w="108" w:type="dxa"/>
+              <w:bottom w:w="0" w:type="dxa"/>
+              <w:right w:w="108" w:type="dxa"/>
+            </w:tcMar>
           </w:tcPr>
           <w:p>
+            <w:pPr>
+              <w:spacing w:after="200" w:line="276" w:lineRule="auto"/>
+            </w:pPr>
             <w:r>
+              <w:rPr>
+                <w:rFonts w:ascii="Cambria" w:hAnsi="Cambria" w:eastAsia="ＭＳ 明朝" w:cs="Cambria" w:asciiTheme="minorHAnsi" w:hAnsiTheme="minorHAnsi" w:eastAsiaTheme="minorEastAsia" w:csTheme="minorBidi"/>
+                <w:sz w:val="22"/>
+                <w:szCs w:val="22"/>
+              </w:rPr>
               <w:t>进行中</w:t>
             </w:r>
           </w:p>
         </w:tc>
         <w:tc>
           <w:tcPr>
-            <w:tcW w:type="dxa" w:w="1728"/>
+            <w:tcW w:w="1728" w:type="dxa"/>
+            <w:tcBorders>
+              <w:top w:val="single" w:sz="4" w:space="0" w:color="auto"/>
+              <w:left w:val="single" w:sz="4" w:space="0" w:color="auto"/>
+              <w:bottom w:val="single" w:sz="4" w:space="0" w:color="auto"/>
+              <w:right w:val="single" w:sz="4" w:space="0" w:color="auto"/>
+            </w:tcBorders>
+            <w:tcMar>
+              <w:top w:w="0" w:type="dxa"/>
+              <w:left w:w="108" w:type="dxa"/>
+              <w:bottom w:w="0" w:type="dxa"/>
+              <w:right w:w="108" w:type="dxa"/>
+            </w:tcMar>
           </w:tcPr>
           <w:p>
+            <w:pPr>
+              <w:spacing w:after="200" w:line="276" w:lineRule="auto"/>
+            </w:pPr>
             <w:r>
+              <w:rPr>
+                <w:rFonts w:ascii="Cambria" w:hAnsi="Cambria" w:eastAsia="ＭＳ 明朝" w:cs="Cambria" w:asciiTheme="minorHAnsi" w:hAnsiTheme="minorHAnsi" w:eastAsiaTheme="minorEastAsia" w:csTheme="minorBidi"/>
+                <w:sz w:val="22"/>
+                <w:szCs w:val="22"/>
+              </w:rPr>
               <w:t>用户B</w:t>
             </w:r>
           </w:p>
@@ -299,50 +753,150 @@
       <w:tr>
         <w:tc>
           <w:tcPr>
-            <w:tcW w:type="dxa" w:w="1728"/>
+            <w:tcW w:w="1728" w:type="dxa"/>
+            <w:tcBorders>
+              <w:top w:val="single" w:sz="4" w:space="0" w:color="auto"/>
+              <w:left w:val="single" w:sz="4" w:space="0" w:color="auto"/>
+              <w:bottom w:val="single" w:sz="4" w:space="0" w:color="auto"/>
+              <w:right w:val="single" w:sz="4" w:space="0" w:color="auto"/>
+            </w:tcBorders>
+            <w:tcMar>
+              <w:top w:w="0" w:type="dxa"/>
+              <w:left w:w="108" w:type="dxa"/>
+              <w:bottom w:w="0" w:type="dxa"/>
+              <w:right w:w="108" w:type="dxa"/>
+            </w:tcMar>
           </w:tcPr>
           <w:p>
+            <w:pPr>
+              <w:spacing w:after="200" w:line="276" w:lineRule="auto"/>
+            </w:pPr>
             <w:r>
+              <w:rPr>
+                <w:rFonts w:ascii="Cambria" w:hAnsi="Cambria" w:eastAsia="ＭＳ 明朝" w:cs="Cambria" w:asciiTheme="minorHAnsi" w:hAnsiTheme="minorHAnsi" w:eastAsiaTheme="minorEastAsia" w:csTheme="minorBidi"/>
+                <w:sz w:val="22"/>
+                <w:szCs w:val="22"/>
+              </w:rPr>
               <w:t>A-003</w:t>
             </w:r>
           </w:p>
         </w:tc>
         <w:tc>
           <w:tcPr>
-            <w:tcW w:type="dxa" w:w="1728"/>
+            <w:tcW w:w="1728" w:type="dxa"/>
+            <w:tcBorders>
+              <w:top w:val="single" w:sz="4" w:space="0" w:color="auto"/>
+              <w:left w:val="single" w:sz="4" w:space="0" w:color="auto"/>
+              <w:bottom w:val="single" w:sz="4" w:space="0" w:color="auto"/>
+              <w:right w:val="single" w:sz="4" w:space="0" w:color="auto"/>
+            </w:tcBorders>
+            <w:tcMar>
+              <w:top w:w="0" w:type="dxa"/>
+              <w:left w:w="108" w:type="dxa"/>
+              <w:bottom w:w="0" w:type="dxa"/>
+              <w:right w:w="108" w:type="dxa"/>
+            </w:tcMar>
           </w:tcPr>
           <w:p>
+            <w:pPr>
+              <w:spacing w:after="200" w:line="276" w:lineRule="auto"/>
+            </w:pPr>
             <w:r>
+              <w:rPr>
+                <w:rFonts w:ascii="Cambria" w:hAnsi="Cambria" w:eastAsia="ＭＳ 明朝" w:cs="Cambria" w:asciiTheme="minorHAnsi" w:hAnsiTheme="minorHAnsi" w:eastAsiaTheme="minorEastAsia" w:csTheme="minorBidi"/>
+                <w:sz w:val="22"/>
+                <w:szCs w:val="22"/>
+              </w:rPr>
               <w:t>示例功能三</w:t>
             </w:r>
           </w:p>
         </w:tc>
         <w:tc>
           <w:tcPr>
-            <w:tcW w:type="dxa" w:w="1728"/>
+            <w:tcW w:w="1728" w:type="dxa"/>
+            <w:tcBorders>
+              <w:top w:val="single" w:sz="4" w:space="0" w:color="auto"/>
+              <w:left w:val="single" w:sz="4" w:space="0" w:color="auto"/>
+              <w:bottom w:val="single" w:sz="4" w:space="0" w:color="auto"/>
+              <w:right w:val="single" w:sz="4" w:space="0" w:color="auto"/>
+            </w:tcBorders>
+            <w:tcMar>
+              <w:top w:w="0" w:type="dxa"/>
+              <w:left w:w="108" w:type="dxa"/>
+              <w:bottom w:w="0" w:type="dxa"/>
+              <w:right w:w="108" w:type="dxa"/>
+            </w:tcMar>
           </w:tcPr>
           <w:p>
+            <w:pPr>
+              <w:spacing w:after="200" w:line="276" w:lineRule="auto"/>
+            </w:pPr>
             <w:r>
+              <w:rPr>
+                <w:rFonts w:ascii="Cambria" w:hAnsi="Cambria" w:eastAsia="ＭＳ 明朝" w:cs="Cambria" w:asciiTheme="minorHAnsi" w:hAnsiTheme="minorHAnsi" w:eastAsiaTheme="minorEastAsia" w:csTheme="minorBidi"/>
+                <w:sz w:val="22"/>
+                <w:szCs w:val="22"/>
+              </w:rPr>
               <w:t>类别甲</w:t>
             </w:r>
           </w:p>
         </w:tc>
         <w:tc>
           <w:tcPr>
-            <w:tcW w:type="dxa" w:w="1728"/>
+            <w:tcW w:w="1728" w:type="dxa"/>
+            <w:tcBorders>
+              <w:top w:val="single" w:sz="4" w:space="0" w:color="auto"/>
+              <w:left w:val="single" w:sz="4" w:space="0" w:color="auto"/>
+              <w:bottom w:val="single" w:sz="4" w:space="0" w:color="auto"/>
+              <w:right w:val="single" w:sz="4" w:space="0" w:color="auto"/>
+            </w:tcBorders>
+            <w:tcMar>
+              <w:top w:w="0" w:type="dxa"/>
+              <w:left w:w="108" w:type="dxa"/>
+              <w:bottom w:w="0" w:type="dxa"/>
+              <w:right w:w="108" w:type="dxa"/>
+            </w:tcMar>
           </w:tcPr>
           <w:p>
+            <w:pPr>
+              <w:spacing w:after="200" w:line="276" w:lineRule="auto"/>
+            </w:pPr>
             <w:r>
+              <w:rPr>
+                <w:rFonts w:ascii="Cambria" w:hAnsi="Cambria" w:eastAsia="ＭＳ 明朝" w:cs="Cambria" w:asciiTheme="minorHAnsi" w:hAnsiTheme="minorHAnsi" w:eastAsiaTheme="minorEastAsia" w:csTheme="minorBidi"/>
+                <w:sz w:val="22"/>
+                <w:szCs w:val="22"/>
+              </w:rPr>
               <w:t>未开始</w:t>
             </w:r>
           </w:p>
         </w:tc>
         <w:tc>
           <w:tcPr>
-            <w:tcW w:type="dxa" w:w="1728"/>
+            <w:tcW w:w="1728" w:type="dxa"/>
+            <w:tcBorders>
+              <w:top w:val="single" w:sz="4" w:space="0" w:color="auto"/>
+              <w:left w:val="single" w:sz="4" w:space="0" w:color="auto"/>
+              <w:bottom w:val="single" w:sz="4" w:space="0" w:color="auto"/>
+              <w:right w:val="single" w:sz="4" w:space="0" w:color="auto"/>
+            </w:tcBorders>
+            <w:tcMar>
+              <w:top w:w="0" w:type="dxa"/>
+              <w:left w:w="108" w:type="dxa"/>
+              <w:bottom w:w="0" w:type="dxa"/>
+              <w:right w:w="108" w:type="dxa"/>
+            </w:tcMar>
           </w:tcPr>
           <w:p>
+            <w:pPr>
+              <w:spacing w:after="200" w:line="276" w:lineRule="auto"/>
+            </w:pPr>
             <w:r>
+              <w:rPr>
+                <w:rFonts w:ascii="Cambria" w:hAnsi="Cambria" w:eastAsia="ＭＳ 明朝" w:cs="Cambria" w:asciiTheme="minorHAnsi" w:hAnsiTheme="minorHAnsi" w:eastAsiaTheme="minorEastAsia" w:csTheme="minorBidi"/>
+                <w:sz w:val="22"/>
+                <w:szCs w:val="22"/>
+              </w:rPr>
               <w:t>用户C</w:t>
             </w:r>
           </w:p>
@@ -351,60 +905,160 @@
       <w:tr>
         <w:tc>
           <w:tcPr>
-            <w:tcW w:type="dxa" w:w="1728"/>
+            <w:tcW w:w="1728" w:type="dxa"/>
+            <w:tcBorders>
+              <w:top w:val="single" w:sz="4" w:space="0" w:color="auto"/>
+              <w:left w:val="single" w:sz="4" w:space="0" w:color="auto"/>
+              <w:bottom w:val="single" w:sz="4" w:space="0" w:color="auto"/>
+              <w:right w:val="single" w:sz="4" w:space="0" w:color="auto"/>
+            </w:tcBorders>
+            <w:tcMar>
+              <w:top w:w="0" w:type="dxa"/>
+              <w:left w:w="108" w:type="dxa"/>
+              <w:bottom w:w="0" w:type="dxa"/>
+              <w:right w:w="108" w:type="dxa"/>
+            </w:tcMar>
           </w:tcPr>
           <w:p>
+            <w:pPr>
+              <w:spacing w:after="200" w:line="276" w:lineRule="auto"/>
+            </w:pPr>
             <w:r>
+              <w:rPr>
+                <w:rFonts w:ascii="Cambria" w:hAnsi="Cambria" w:eastAsia="ＭＳ 明朝" w:cs="Cambria" w:asciiTheme="minorHAnsi" w:hAnsiTheme="minorHAnsi" w:eastAsiaTheme="minorEastAsia" w:csTheme="minorBidi"/>
+                <w:sz w:val="22"/>
+                <w:szCs w:val="22"/>
+              </w:rPr>
               <w:t>A-004</w:t>
             </w:r>
           </w:p>
         </w:tc>
         <w:tc>
           <w:tcPr>
-            <w:tcW w:type="dxa" w:w="1728"/>
+            <w:tcW w:w="1728" w:type="dxa"/>
+            <w:tcBorders>
+              <w:top w:val="single" w:sz="4" w:space="0" w:color="auto"/>
+              <w:left w:val="single" w:sz="4" w:space="0" w:color="auto"/>
+              <w:bottom w:val="single" w:sz="4" w:space="0" w:color="auto"/>
+              <w:right w:val="single" w:sz="4" w:space="0" w:color="auto"/>
+            </w:tcBorders>
+            <w:tcMar>
+              <w:top w:w="0" w:type="dxa"/>
+              <w:left w:w="108" w:type="dxa"/>
+              <w:bottom w:w="0" w:type="dxa"/>
+              <w:right w:w="108" w:type="dxa"/>
+            </w:tcMar>
           </w:tcPr>
           <w:p>
+            <w:pPr>
+              <w:spacing w:after="200" w:line="276" w:lineRule="auto"/>
+            </w:pPr>
             <w:r>
+              <w:rPr>
+                <w:rFonts w:ascii="Cambria" w:hAnsi="Cambria" w:eastAsia="ＭＳ 明朝" w:cs="Cambria" w:asciiTheme="minorHAnsi" w:hAnsiTheme="minorHAnsi" w:eastAsiaTheme="minorEastAsia" w:csTheme="minorBidi"/>
+                <w:sz w:val="22"/>
+                <w:szCs w:val="22"/>
+              </w:rPr>
               <w:t>示例功能四</w:t>
             </w:r>
           </w:p>
         </w:tc>
         <w:tc>
           <w:tcPr>
-            <w:tcW w:type="dxa" w:w="1728"/>
+            <w:tcW w:w="1728" w:type="dxa"/>
+            <w:tcBorders>
+              <w:top w:val="single" w:sz="4" w:space="0" w:color="auto"/>
+              <w:left w:val="single" w:sz="4" w:space="0" w:color="auto"/>
+              <w:bottom w:val="single" w:sz="4" w:space="0" w:color="auto"/>
+              <w:right w:val="single" w:sz="4" w:space="0" w:color="auto"/>
+            </w:tcBorders>
+            <w:tcMar>
+              <w:top w:w="0" w:type="dxa"/>
+              <w:left w:w="108" w:type="dxa"/>
+              <w:bottom w:w="0" w:type="dxa"/>
+              <w:right w:w="108" w:type="dxa"/>
+            </w:tcMar>
           </w:tcPr>
           <w:p>
+            <w:pPr>
+              <w:spacing w:after="200" w:line="276" w:lineRule="auto"/>
+            </w:pPr>
             <w:r>
+              <w:rPr>
+                <w:rFonts w:ascii="Cambria" w:hAnsi="Cambria" w:eastAsia="ＭＳ 明朝" w:cs="Cambria" w:asciiTheme="minorHAnsi" w:hAnsiTheme="minorHAnsi" w:eastAsiaTheme="minorEastAsia" w:csTheme="minorBidi"/>
+                <w:sz w:val="22"/>
+                <w:szCs w:val="22"/>
+              </w:rPr>
               <w:t>类别丙</w:t>
             </w:r>
           </w:p>
         </w:tc>
         <w:tc>
           <w:tcPr>
-            <w:tcW w:type="dxa" w:w="1728"/>
+            <w:tcW w:w="1728" w:type="dxa"/>
+            <w:tcBorders>
+              <w:top w:val="single" w:sz="4" w:space="0" w:color="auto"/>
+              <w:left w:val="single" w:sz="4" w:space="0" w:color="auto"/>
+              <w:bottom w:val="single" w:sz="4" w:space="0" w:color="auto"/>
+              <w:right w:val="single" w:sz="4" w:space="0" w:color="auto"/>
+            </w:tcBorders>
+            <w:tcMar>
+              <w:top w:w="0" w:type="dxa"/>
+              <w:left w:w="108" w:type="dxa"/>
+              <w:bottom w:w="0" w:type="dxa"/>
+              <w:right w:w="108" w:type="dxa"/>
+            </w:tcMar>
           </w:tcPr>
           <w:p>
+            <w:pPr>
+              <w:spacing w:after="200" w:line="276" w:lineRule="auto"/>
+            </w:pPr>
             <w:r>
+              <w:rPr>
+                <w:rFonts w:ascii="Cambria" w:hAnsi="Cambria" w:eastAsia="ＭＳ 明朝" w:cs="Cambria" w:asciiTheme="minorHAnsi" w:hAnsiTheme="minorHAnsi" w:eastAsiaTheme="minorEastAsia" w:csTheme="minorBidi"/>
+                <w:sz w:val="22"/>
+                <w:szCs w:val="22"/>
+              </w:rPr>
               <w:t>已完成</w:t>
             </w:r>
           </w:p>
         </w:tc>
         <w:tc>
           <w:tcPr>
-            <w:tcW w:type="dxa" w:w="1728"/>
+            <w:tcW w:w="1728" w:type="dxa"/>
+            <w:tcBorders>
+              <w:top w:val="single" w:sz="4" w:space="0" w:color="auto"/>
+              <w:left w:val="single" w:sz="4" w:space="0" w:color="auto"/>
+              <w:bottom w:val="single" w:sz="4" w:space="0" w:color="auto"/>
+              <w:right w:val="single" w:sz="4" w:space="0" w:color="auto"/>
+            </w:tcBorders>
+            <w:tcMar>
+              <w:top w:w="0" w:type="dxa"/>
+              <w:left w:w="108" w:type="dxa"/>
+              <w:bottom w:w="0" w:type="dxa"/>
+              <w:right w:w="108" w:type="dxa"/>
+            </w:tcMar>
           </w:tcPr>
           <w:p>
+            <w:pPr>
+              <w:spacing w:after="200" w:line="276" w:lineRule="auto"/>
+            </w:pPr>
             <w:r>
+              <w:rPr>
+                <w:rFonts w:ascii="Cambria" w:hAnsi="Cambria" w:eastAsia="ＭＳ 明朝" w:cs="Cambria" w:asciiTheme="minorHAnsi" w:hAnsiTheme="minorHAnsi" w:eastAsiaTheme="minorEastAsia" w:csTheme="minorBidi"/>
+                <w:sz w:val="22"/>
+                <w:szCs w:val="22"/>
+              </w:rPr>
               <w:t>用户D</w:t>
             </w:r>
           </w:p>
         </w:tc>
       </w:tr>
     </w:tbl>
+    <w:p/>
     <w:sectPr>
       <w:pgSz w:w="12240" w:h="15840"/>
       <w:pgMar w:top="1440" w:right="1800" w:bottom="1440" w:left="1800" w:header="720" w:footer="720" w:gutter="0"/>
-      <w:cols w:space="720"/>
       <w:docGrid w:linePitch="360"/>
     </w:sectPr>
   </w:body>

</xml_diff>